<commit_message>
Align report with notebook questions
</commit_message>
<xml_diff>
--- a/docs/relatorio_ra1.docx
+++ b/docs/relatorio_ra1.docx
@@ -35,12 +35,7 @@
     </w:p>
     <w:p>
       <w:r>
-        <w:rPr>
-          <w:b/>
-          <w:color w:val="9B1830"/>
-          <w:sz w:val="96"/>
-        </w:rPr>
-        <w:t>RA1</w:t>
+        <w:t>RA1 e RA2</w:t>
       </w:r>
     </w:p>
     <w:p>
@@ -48,9 +43,9 @@
         <w:pStyle w:val="Title"/>
       </w:pPr>
       <w:r>
-        <w:t>Ingestão e preparação</w:t>
+        <w:t>Ingestão, preparação</w:t>
         <w:br/>
-        <w:t>dos dados</w:t>
+        <w:t>e análise dos dados</w:t>
       </w:r>
     </w:p>
     <w:p>
@@ -80,10 +75,7 @@
         <w:t xml:space="preserve">Projeto  </w:t>
       </w:r>
       <w:r>
-        <w:rPr>
-          <w:color w:val="000000"/>
-        </w:rPr>
-        <w:t xml:space="preserve">Preparação de dados e acompanhamento de vendas de uma loja online</w:t>
+        <w:t>Preparação e análise de registros de uma loja online, com demonstração de streaming</w:t>
       </w:r>
     </w:p>
     <w:p>
@@ -212,10 +204,7 @@
         <w:spacing w:after="160"/>
       </w:pPr>
       <w:r>
-        <w:rPr>
-          <w:color w:val="000000"/>
-        </w:rPr>
-        <w:t xml:space="preserve">O projeto prepara registros de uma loja online para permitir o acompanhamento posterior de vendas por período, produto e país. O arquivo reúne itens de mercadorias, cancelamentos e lançamentos administrativos. Misturar esses registros ou interpretar cada linha como um pedido pode distorcer a leitura da operação. A etapa RA1 documenta a origem, mede a qualidade e produz um conjunto rastreável para as próximas análises.</w:t>
+        <w:t>O projeto prepara registros de uma loja online para analisar o valor dos itens por dia e as quantidades por produto. No RA2, demonstra como os totais por minuto mudam com a chegada de novos eventos. A base histórica reúne itens de mercadorias, cancelamentos e lançamentos administrativos; por isso, é preciso definir o recorte e não interpretar cada linha como um pedido inteiro.</w:t>
       </w:r>
     </w:p>
     <w:p>
@@ -231,10 +220,7 @@
         <w:spacing w:after="160"/>
       </w:pPr>
       <w:r>
-        <w:rPr>
-          <w:color w:val="000000"/>
-        </w:rPr>
-        <w:t xml:space="preserve">Preparar registros positivos de mercadorias da base Online Retail, entre 1º de dezembro de 2010 e 9 de dezembro de 2011. A unidade de análise é o item da transação. O recorte não representa receita líquida: retirar linhas de cancelamento não desfaz automaticamente a venda original. Agregações de negócio, indicadores e conclusões ficam fora deste relatório RA1.</w:t>
+        <w:t>O RA1 prepara registros positivos de mercadorias da base Online Retail, entre 1º de dezembro de 2010 e 9 de dezembro de 2011, e responde descritivamente às perguntas sobre valor diário e quantidade por produto. No RA2, seis eventos fictícios demonstram a atualização dos valores por minuto. Uma linha representa um item da transação. Os resultados do RA1 são valores registrados no recorte, não receita líquida nem lucro.</w:t>
       </w:r>
     </w:p>
     <w:p>
@@ -313,12 +299,7 @@
               <w:spacing w:after="60" w:before="60"/>
             </w:pPr>
             <w:r>
-              <w:rPr>
-                <w:b/>
-                <w:color w:val="FFFFFF"/>
-                <w:sz w:val="18"/>
-              </w:rPr>
-              <w:t>Pergunta a investigar</w:t>
+              <w:t>Pergunta analítica</w:t>
             </w:r>
           </w:p>
         </w:tc>
@@ -339,12 +320,7 @@
               <w:spacing w:after="60" w:before="60"/>
             </w:pPr>
             <w:r>
-              <w:rPr>
-                <w:b/>
-                <w:color w:val="FFFFFF"/>
-                <w:sz w:val="18"/>
-              </w:rPr>
-              <w:t>Dados necessários</w:t>
+              <w:t>Dados usados</w:t>
             </w:r>
           </w:p>
         </w:tc>
@@ -366,16 +342,8 @@
             </w:tcMar>
           </w:tcPr>
           <w:p>
-            <w:pPr>
-              <w:spacing w:after="60" w:before="60"/>
-            </w:pPr>
             <w:r>
-              <w:rPr>
-                <w:b w:val="0"/>
-                <w:color w:val="000000"/>
-                <w:sz w:val="18"/>
-              </w:rPr>
-              <w:t xml:space="preserve">P1</w:t>
+              <w:t>P1</w:t>
             </w:r>
           </w:p>
         </w:tc>
@@ -392,16 +360,8 @@
             </w:tcMar>
           </w:tcPr>
           <w:p>
-            <w:pPr>
-              <w:spacing w:after="60" w:before="60"/>
-            </w:pPr>
             <w:r>
-              <w:rPr>
-                <w:b w:val="0"/>
-                <w:color w:val="000000"/>
-                <w:sz w:val="18"/>
-              </w:rPr>
-              <w:t xml:space="preserve">Como a quantidade registrada de mercadorias varia ao longo do período?</w:t>
+              <w:t>Como o valor dos registros positivos varia por dia?</w:t>
             </w:r>
           </w:p>
         </w:tc>
@@ -418,16 +378,8 @@
             </w:tcMar>
           </w:tcPr>
           <w:p>
-            <w:pPr>
-              <w:spacing w:after="60" w:before="60"/>
-            </w:pPr>
             <w:r>
-              <w:rPr>
-                <w:b w:val="0"/>
-                <w:color w:val="000000"/>
-                <w:sz w:val="18"/>
-              </w:rPr>
-              <w:t xml:space="preserve">InvoiceDate, Quantity; registros positivos de mercadorias.</w:t>
+              <w:t>InvoiceDate, Quantity e UnitPrice; registros positivos de mercadorias do RA1.</w:t>
             </w:r>
           </w:p>
         </w:tc>
@@ -449,16 +401,8 @@
             </w:tcMar>
           </w:tcPr>
           <w:p>
-            <w:pPr>
-              <w:spacing w:after="60" w:before="60"/>
-            </w:pPr>
             <w:r>
-              <w:rPr>
-                <w:b w:val="0"/>
-                <w:color w:val="000000"/>
-                <w:sz w:val="18"/>
-              </w:rPr>
-              <w:t xml:space="preserve">P2</w:t>
+              <w:t>P2</w:t>
             </w:r>
           </w:p>
         </w:tc>
@@ -475,16 +419,8 @@
             </w:tcMar>
           </w:tcPr>
           <w:p>
-            <w:pPr>
-              <w:spacing w:after="60" w:before="60"/>
-            </w:pPr>
             <w:r>
-              <w:rPr>
-                <w:b w:val="0"/>
-                <w:color w:val="000000"/>
-                <w:sz w:val="18"/>
-              </w:rPr>
-              <w:t xml:space="preserve">Quais produtos concentram as quantidades registradas nesse recorte?</w:t>
+              <w:t>Quais produtos têm maior quantidade registrada?</w:t>
             </w:r>
           </w:p>
         </w:tc>
@@ -501,16 +437,8 @@
             </w:tcMar>
           </w:tcPr>
           <w:p>
-            <w:pPr>
-              <w:spacing w:after="60" w:before="60"/>
-            </w:pPr>
             <w:r>
-              <w:rPr>
-                <w:b w:val="0"/>
-                <w:color w:val="000000"/>
-                <w:sz w:val="18"/>
-              </w:rPr>
-              <w:t xml:space="preserve">StockCode, Description, Quantity; mesmo período e filtros.</w:t>
+              <w:t>StockCode, Description e Quantity; conjunto preparado no RA1.</w:t>
             </w:r>
           </w:p>
         </w:tc>
@@ -532,16 +460,8 @@
             </w:tcMar>
           </w:tcPr>
           <w:p>
-            <w:pPr>
-              <w:spacing w:after="60" w:before="60"/>
-            </w:pPr>
             <w:r>
-              <w:rPr>
-                <w:b w:val="0"/>
-                <w:color w:val="000000"/>
-                <w:sz w:val="18"/>
-              </w:rPr>
-              <w:t xml:space="preserve">P3</w:t>
+              <w:t>P3</w:t>
             </w:r>
           </w:p>
         </w:tc>
@@ -558,16 +478,8 @@
             </w:tcMar>
           </w:tcPr>
           <w:p>
-            <w:pPr>
-              <w:spacing w:after="60" w:before="60"/>
-            </w:pPr>
             <w:r>
-              <w:rPr>
-                <w:b w:val="0"/>
-                <w:color w:val="000000"/>
-                <w:sz w:val="18"/>
-              </w:rPr>
-              <w:t xml:space="preserve">Como as quantidades registradas se distribuem entre os países?</w:t>
+              <w:t>No RA2, como os valores por minuto mudam quando chegam novos eventos?</w:t>
             </w:r>
           </w:p>
         </w:tc>
@@ -584,16 +496,8 @@
             </w:tcMar>
           </w:tcPr>
           <w:p>
-            <w:pPr>
-              <w:spacing w:after="60" w:before="60"/>
-            </w:pPr>
             <w:r>
-              <w:rPr>
-                <w:b w:val="0"/>
-                <w:color w:val="000000"/>
-                <w:sz w:val="18"/>
-              </w:rPr>
-              <w:t xml:space="preserve">Country, Quantity; mesmo período e filtros.</w:t>
+              <w:t>Seis eventos simulados; event_time, Quantity e UnitPrice; janelas de um minuto.</w:t>
             </w:r>
           </w:p>
         </w:tc>
@@ -752,10 +656,7 @@
         <w:spacing w:after="160"/>
       </w:pPr>
       <w:r>
-        <w:rPr>
-          <w:color w:val="000000"/>
-        </w:rPr>
-        <w:t xml:space="preserve">F1 apoia P1 com InvoiceDate e Quantity, P2 com StockCode/Description e Quantity e P3 com Country. UnitPrice permite futuras medidas monetárias, respeitando a moeda GBP e as limitações do recorte. O relatório registra somente a preparação, sem responder às perguntas por agregação.</w:t>
+        <w:t>No RA1, P1 combina InvoiceDate, Quantity e UnitPrice para somar o valor dos registros por dia; P2 soma Quantity por StockCode e Description. P3 pertence ao RA2 e usa eventos simulados, separados da base histórica. Os resultados são descritivos e não representam vendas líquidas.</w:t>
       </w:r>
     </w:p>
     <w:p>
@@ -1207,6 +1108,374 @@
       </w:pPr>
       <w:r>
         <w:t>Dicionário inicial dos dados</w:t>
+      </w:r>
+    </w:p>
+    <w:p>
+      <w:pPr>
+        <w:pStyle w:val="Heading2"/>
+      </w:pPr>
+      <w:r>
+        <w:t>Respostas às perguntas analíticas</w:t>
+      </w:r>
+    </w:p>
+    <w:p>
+      <w:pPr>
+        <w:pStyle w:val="Heading3"/>
+      </w:pPr>
+      <w:r>
+        <w:t>P1 — Como o valor dos registros positivos varia por dia?</w:t>
+      </w:r>
+    </w:p>
+    <w:p>
+      <w:pPr/>
+      <w:r>
+        <w:t>Somamos Quantity × UnitPrice por data, usando os registros positivos de mercadorias preparados no RA1. Há registros em 305 dias: o valor médio por dia com registros foi GBP 33.676,83 e a mediana foi GBP 28.530,63. A variação foi ampla: o menor total diário foi GBP 3.457,11, em 06/02/2011, e o maior foi GBP 198.114,26, em 09/12/2011. A média diária aumentou entre setembro (GBP 39.633,67) e novembro de 2011 (GBP 56.067,14). Dezembro tem apenas oito dias com registros no período da base, então não é comparável a um mês completo. Esses valores são somas de registros positivos, não vendas líquidas.</w:t>
+      </w:r>
+    </w:p>
+    <w:p>
+      <w:pPr>
+        <w:pStyle w:val="Heading3"/>
+      </w:pPr>
+      <w:r>
+        <w:t>P2 — Quais produtos têm maior quantidade registrada?</w:t>
+      </w:r>
+    </w:p>
+    <w:p>
+      <w:pPr/>
+      <w:r>
+        <w:t>Somamos Quantity por código e descrição no conjunto preparado. Os cinco maiores totais foram:</w:t>
+      </w:r>
+    </w:p>
+    <w:tbl>
+      <w:tblPr>
+        <w:tblW w:type="auto" w:w="0"/>
+        <w:tblLook w:firstColumn="1" w:firstRow="1" w:lastColumn="0" w:lastRow="0" w:noHBand="0" w:noVBand="1" w:val="04A0"/>
+      </w:tblPr>
+      <w:tblGrid>
+        <w:gridCol w:w="2367"/>
+        <w:gridCol w:w="2367"/>
+        <w:gridCol w:w="2367"/>
+        <w:gridCol w:w="2367"/>
+      </w:tblGrid>
+      <w:tr>
+        <w:tc>
+          <w:tcPr>
+            <w:tcW w:type="dxa" w:w="850"/>
+            <w:vAlign w:val="center"/>
+            <w:shd w:fill="9B1830"/>
+            <w:tcMar>
+              <w:top w:w="90" w:type="dxa"/>
+              <w:left w:w="90" w:type="dxa"/>
+              <w:bottom w:w="90" w:type="dxa"/>
+              <w:right w:w="90" w:type="dxa"/>
+            </w:tcMar>
+          </w:tcPr>
+          <w:p>
+            <w:r>
+              <w:rPr>
+                <w:b/>
+                <w:color w:val="FFFFFF"/>
+              </w:rPr>
+              <w:t>Posição</w:t>
+            </w:r>
+          </w:p>
+        </w:tc>
+        <w:tc>
+          <w:tcPr>
+            <w:tcW w:type="dxa" w:w="3458"/>
+            <w:vAlign w:val="center"/>
+            <w:shd w:fill="9B1830"/>
+            <w:tcMar>
+              <w:top w:w="90" w:type="dxa"/>
+              <w:left w:w="90" w:type="dxa"/>
+              <w:bottom w:w="90" w:type="dxa"/>
+              <w:right w:w="90" w:type="dxa"/>
+            </w:tcMar>
+          </w:tcPr>
+          <w:p>
+            <w:r>
+              <w:rPr>
+                <w:b/>
+                <w:color w:val="FFFFFF"/>
+              </w:rPr>
+              <w:t>Produto</w:t>
+            </w:r>
+          </w:p>
+        </w:tc>
+        <w:tc>
+          <w:tcPr>
+            <w:tcW w:type="dxa" w:w="2835"/>
+            <w:vAlign w:val="center"/>
+            <w:shd w:fill="9B1830"/>
+            <w:tcMar>
+              <w:top w:w="90" w:type="dxa"/>
+              <w:left w:w="90" w:type="dxa"/>
+              <w:bottom w:w="90" w:type="dxa"/>
+              <w:right w:w="90" w:type="dxa"/>
+            </w:tcMar>
+          </w:tcPr>
+          <w:p>
+            <w:r>
+              <w:rPr>
+                <w:b/>
+                <w:color w:val="FFFFFF"/>
+              </w:rPr>
+              <w:t>Quantidade (unidades)</w:t>
+            </w:r>
+          </w:p>
+        </w:tc>
+        <w:tc>
+          <w:tcPr>
+            <w:tcW w:type="dxa" w:w="2324"/>
+            <w:vAlign w:val="center"/>
+            <w:shd w:fill="9B1830"/>
+            <w:tcMar>
+              <w:top w:w="90" w:type="dxa"/>
+              <w:left w:w="90" w:type="dxa"/>
+              <w:bottom w:w="90" w:type="dxa"/>
+              <w:right w:w="90" w:type="dxa"/>
+            </w:tcMar>
+          </w:tcPr>
+          <w:p>
+            <w:r>
+              <w:rPr>
+                <w:b/>
+                <w:color w:val="FFFFFF"/>
+              </w:rPr>
+              <w:t>Registros</w:t>
+            </w:r>
+          </w:p>
+        </w:tc>
+      </w:tr>
+      <w:tr>
+        <w:tc>
+          <w:tcPr>
+            <w:tcW w:type="dxa" w:w="2367"/>
+          </w:tcPr>
+          <w:p>
+            <w:r>
+              <w:t>1</w:t>
+            </w:r>
+          </w:p>
+        </w:tc>
+        <w:tc>
+          <w:tcPr>
+            <w:tcW w:type="dxa" w:w="2367"/>
+          </w:tcPr>
+          <w:p>
+            <w:r>
+              <w:t>23843 — PAPER CRAFT , LITTLE BIRDIE</w:t>
+            </w:r>
+          </w:p>
+        </w:tc>
+        <w:tc>
+          <w:tcPr>
+            <w:tcW w:type="dxa" w:w="2367"/>
+          </w:tcPr>
+          <w:p>
+            <w:r>
+              <w:t>80.995</w:t>
+            </w:r>
+          </w:p>
+        </w:tc>
+        <w:tc>
+          <w:tcPr>
+            <w:tcW w:type="dxa" w:w="2367"/>
+          </w:tcPr>
+          <w:p>
+            <w:r>
+              <w:t>1</w:t>
+            </w:r>
+          </w:p>
+        </w:tc>
+      </w:tr>
+      <w:tr>
+        <w:tc>
+          <w:tcPr>
+            <w:tcW w:type="dxa" w:w="2367"/>
+          </w:tcPr>
+          <w:p>
+            <w:r>
+              <w:t>2</w:t>
+            </w:r>
+          </w:p>
+        </w:tc>
+        <w:tc>
+          <w:tcPr>
+            <w:tcW w:type="dxa" w:w="2367"/>
+          </w:tcPr>
+          <w:p>
+            <w:r>
+              <w:t>23166 — MEDIUM CERAMIC TOP STORAGE JAR</w:t>
+            </w:r>
+          </w:p>
+        </w:tc>
+        <w:tc>
+          <w:tcPr>
+            <w:tcW w:type="dxa" w:w="2367"/>
+          </w:tcPr>
+          <w:p>
+            <w:r>
+              <w:t>78.033</w:t>
+            </w:r>
+          </w:p>
+        </w:tc>
+        <w:tc>
+          <w:tcPr>
+            <w:tcW w:type="dxa" w:w="2367"/>
+          </w:tcPr>
+          <w:p>
+            <w:r>
+              <w:t>250</w:t>
+            </w:r>
+          </w:p>
+        </w:tc>
+      </w:tr>
+      <w:tr>
+        <w:tc>
+          <w:tcPr>
+            <w:tcW w:type="dxa" w:w="2367"/>
+          </w:tcPr>
+          <w:p>
+            <w:r>
+              <w:t>3</w:t>
+            </w:r>
+          </w:p>
+        </w:tc>
+        <w:tc>
+          <w:tcPr>
+            <w:tcW w:type="dxa" w:w="2367"/>
+          </w:tcPr>
+          <w:p>
+            <w:r>
+              <w:t>84077 — WORLD WAR 2 GLIDERS ASSTD DESIGNS</w:t>
+            </w:r>
+          </w:p>
+        </w:tc>
+        <w:tc>
+          <w:tcPr>
+            <w:tcW w:type="dxa" w:w="2367"/>
+          </w:tcPr>
+          <w:p>
+            <w:r>
+              <w:t>55.047</w:t>
+            </w:r>
+          </w:p>
+        </w:tc>
+        <w:tc>
+          <w:tcPr>
+            <w:tcW w:type="dxa" w:w="2367"/>
+          </w:tcPr>
+          <w:p>
+            <w:r>
+              <w:t>537</w:t>
+            </w:r>
+          </w:p>
+        </w:tc>
+      </w:tr>
+      <w:tr>
+        <w:tc>
+          <w:tcPr>
+            <w:tcW w:type="dxa" w:w="2367"/>
+          </w:tcPr>
+          <w:p>
+            <w:r>
+              <w:t>4</w:t>
+            </w:r>
+          </w:p>
+        </w:tc>
+        <w:tc>
+          <w:tcPr>
+            <w:tcW w:type="dxa" w:w="2367"/>
+          </w:tcPr>
+          <w:p>
+            <w:r>
+              <w:t>85099B — JUMBO BAG RED RETROSPOT</w:t>
+            </w:r>
+          </w:p>
+        </w:tc>
+        <w:tc>
+          <w:tcPr>
+            <w:tcW w:type="dxa" w:w="2367"/>
+          </w:tcPr>
+          <w:p>
+            <w:r>
+              <w:t>48.474</w:t>
+            </w:r>
+          </w:p>
+        </w:tc>
+        <w:tc>
+          <w:tcPr>
+            <w:tcW w:type="dxa" w:w="2367"/>
+          </w:tcPr>
+          <w:p>
+            <w:r>
+              <w:t>2.112</w:t>
+            </w:r>
+          </w:p>
+        </w:tc>
+      </w:tr>
+      <w:tr>
+        <w:tc>
+          <w:tcPr>
+            <w:tcW w:type="dxa" w:w="2367"/>
+          </w:tcPr>
+          <w:p>
+            <w:r>
+              <w:t>5</w:t>
+            </w:r>
+          </w:p>
+        </w:tc>
+        <w:tc>
+          <w:tcPr>
+            <w:tcW w:type="dxa" w:w="2367"/>
+          </w:tcPr>
+          <w:p>
+            <w:r>
+              <w:t>85123A — WHITE HANGING HEART T-LIGHT HOLDER</w:t>
+            </w:r>
+          </w:p>
+        </w:tc>
+        <w:tc>
+          <w:tcPr>
+            <w:tcW w:type="dxa" w:w="2367"/>
+          </w:tcPr>
+          <w:p>
+            <w:r>
+              <w:t>37.599</w:t>
+            </w:r>
+          </w:p>
+        </w:tc>
+        <w:tc>
+          <w:tcPr>
+            <w:tcW w:type="dxa" w:w="2367"/>
+          </w:tcPr>
+          <w:p>
+            <w:r>
+              <w:t>2.256</w:t>
+            </w:r>
+          </w:p>
+        </w:tc>
+      </w:tr>
+    </w:tbl>
+    <w:p>
+      <w:pPr/>
+      <w:r>
+        <w:t>O código 23843 lidera por causa de um único registro com 80.995 unidades. Como valores positivos extremos foram mantidos no recorte, esse resultado deve ser lido com cautela: a maior quantidade acumulada não significa necessariamente o produto mais vendido com maior frequência.</w:t>
+      </w:r>
+    </w:p>
+    <w:p>
+      <w:pPr>
+        <w:pStyle w:val="Heading3"/>
+      </w:pPr>
+      <w:r>
+        <w:t>P3 — No RA2, como os valores por minuto mudam quando chegam novos eventos?</w:t>
+      </w:r>
+    </w:p>
+    <w:p>
+      <w:pPr/>
+      <w:r>
+        <w:t>O Spark atualizou os totais a cada chegada de dois eventos. Na primeira, a janela das 10:00 somou GBP 25. Na segunda, a janela das 10:00 passou a GBP 55 e a das 10:01 começou com GBP 20. Na terceira, os totais finais ficaram em GBP 55 às 10:00, GBP 30 às 10:01 e GBP 10 às 10:02. A soma é GBP 95. São seis eventos fictícios, criados para a demonstração, e não vendas reais.</w:t>
       </w:r>
     </w:p>
     <w:tbl>

</xml_diff>